<commit_message>
CLI CarGross.py, app Streamlit, dataset 2 y documentación (D-13 a D-19)
Co-Authored-By: Claude Opus 5.5 <noreply@anthropic.com>
Claude-Session: https://claude.ai/code/session_01D27XotwJUKxsXPPTtn485D
</commit_message>
<xml_diff>
--- a/docs/Registro_de_decisiones.docx
+++ b/docs/Registro_de_decisiones.docx
@@ -1817,6 +1817,951 @@
                 <w:szCs w:val="18"/>
               </w:rPr>
               <w:t xml:space="preserve">Aprobada</w:t>
+            </w:r>
+          </w:p>
+        </w:tc>
+      </w:tr>
+      <w:tr>
+        <w:trPr>
+          <w:cantSplit/>
+        </w:trPr>
+        <w:tc>
+          <w:tcPr>
+            <w:tcW w:type="dxa" w:w="700"/>
+            <w:tcBorders>
+              <w:top w:val="single" w:color="BFBFBF" w:sz="4"/>
+              <w:left w:val="single" w:color="BFBFBF" w:sz="4"/>
+              <w:bottom w:val="single" w:color="BFBFBF" w:sz="4"/>
+              <w:right w:val="single" w:color="BFBFBF" w:sz="4"/>
+            </w:tcBorders>
+            <w:tcMar>
+              <w:top w:type="dxa" w:w="60"/>
+              <w:left w:type="dxa" w:w="80"/>
+              <w:bottom w:type="dxa" w:w="60"/>
+              <w:right w:type="dxa" w:w="80"/>
+            </w:tcMar>
+          </w:tcPr>
+          <w:p>
+            <w:r>
+              <w:rPr>
+                <w:sz w:val="18"/>
+                <w:szCs w:val="18"/>
+              </w:rPr>
+              <w:t>D-13</w:t>
+            </w:r>
+          </w:p>
+        </w:tc>
+        <w:tc>
+          <w:tcPr>
+            <w:tcW w:type="dxa" w:w="1150"/>
+            <w:tcBorders>
+              <w:top w:val="single" w:color="BFBFBF" w:sz="4"/>
+              <w:left w:val="single" w:color="BFBFBF" w:sz="4"/>
+              <w:bottom w:val="single" w:color="BFBFBF" w:sz="4"/>
+              <w:right w:val="single" w:color="BFBFBF" w:sz="4"/>
+            </w:tcBorders>
+            <w:tcMar>
+              <w:top w:type="dxa" w:w="60"/>
+              <w:left w:type="dxa" w:w="80"/>
+              <w:bottom w:type="dxa" w:w="60"/>
+              <w:right w:type="dxa" w:w="80"/>
+            </w:tcMar>
+          </w:tcPr>
+          <w:p>
+            <w:r>
+              <w:rPr>
+                <w:sz w:val="18"/>
+                <w:szCs w:val="18"/>
+              </w:rPr>
+              <w:t>28/10/2026</w:t>
+            </w:r>
+          </w:p>
+        </w:tc>
+        <w:tc>
+          <w:tcPr>
+            <w:tcW w:type="dxa" w:w="2700"/>
+            <w:tcBorders>
+              <w:top w:val="single" w:color="BFBFBF" w:sz="4"/>
+              <w:left w:val="single" w:color="BFBFBF" w:sz="4"/>
+              <w:bottom w:val="single" w:color="BFBFBF" w:sz="4"/>
+              <w:right w:val="single" w:color="BFBFBF" w:sz="4"/>
+            </w:tcBorders>
+            <w:tcMar>
+              <w:top w:type="dxa" w:w="60"/>
+              <w:left w:type="dxa" w:w="80"/>
+              <w:bottom w:type="dxa" w:w="60"/>
+              <w:right w:type="dxa" w:w="80"/>
+            </w:tcMar>
+          </w:tcPr>
+          <w:p>
+            <w:r>
+              <w:rPr>
+                <w:sz w:val="18"/>
+                <w:szCs w:val="18"/>
+              </w:rPr>
+              <w:t>ρ final de ART 1 = 0,65.</w:t>
+            </w:r>
+          </w:p>
+        </w:tc>
+        <w:tc>
+          <w:tcPr>
+            <w:tcW w:type="dxa" w:w="3176"/>
+            <w:tcBorders>
+              <w:top w:val="single" w:color="BFBFBF" w:sz="4"/>
+              <w:left w:val="single" w:color="BFBFBF" w:sz="4"/>
+              <w:bottom w:val="single" w:color="BFBFBF" w:sz="4"/>
+              <w:right w:val="single" w:color="BFBFBF" w:sz="4"/>
+            </w:tcBorders>
+            <w:tcMar>
+              <w:top w:type="dxa" w:w="60"/>
+              <w:left w:type="dxa" w:w="80"/>
+              <w:bottom w:type="dxa" w:w="60"/>
+              <w:right w:type="dxa" w:w="80"/>
+            </w:tcMar>
+          </w:tcPr>
+          <w:p>
+            <w:r>
+              <w:rPr>
+                <w:sz w:val="18"/>
+                <w:szCs w:val="18"/>
+              </w:rPr>
+              <w:t>Primer ρ con pureza ≥ 80% (81,4%), CR 0,109 (871 nodos) y el menor MAE del barrido (0,94/10). Con 0,70 la pureza sube a 84,5% pero con 1220 nodos y MAE 0,96. Barrido: python -m src.barrido_rho.</w:t>
+            </w:r>
+          </w:p>
+        </w:tc>
+        <w:tc>
+          <w:tcPr>
+            <w:tcW w:type="dxa" w:w="1300"/>
+            <w:tcBorders>
+              <w:top w:val="single" w:color="BFBFBF" w:sz="4"/>
+              <w:left w:val="single" w:color="BFBFBF" w:sz="4"/>
+              <w:bottom w:val="single" w:color="BFBFBF" w:sz="4"/>
+              <w:right w:val="single" w:color="BFBFBF" w:sz="4"/>
+            </w:tcBorders>
+            <w:tcMar>
+              <w:top w:type="dxa" w:w="60"/>
+              <w:left w:type="dxa" w:w="80"/>
+              <w:bottom w:type="dxa" w:w="60"/>
+              <w:right w:type="dxa" w:w="80"/>
+            </w:tcMar>
+          </w:tcPr>
+          <w:p>
+            <w:r>
+              <w:rPr>
+                <w:sz w:val="18"/>
+                <w:szCs w:val="18"/>
+              </w:rPr>
+              <w:t>Aprobada</w:t>
+            </w:r>
+          </w:p>
+        </w:tc>
+      </w:tr>
+      <w:tr>
+        <w:trPr>
+          <w:cantSplit/>
+        </w:trPr>
+        <w:tc>
+          <w:tcPr>
+            <w:tcW w:type="dxa" w:w="700"/>
+            <w:tcBorders>
+              <w:top w:val="single" w:color="BFBFBF" w:sz="4"/>
+              <w:left w:val="single" w:color="BFBFBF" w:sz="4"/>
+              <w:bottom w:val="single" w:color="BFBFBF" w:sz="4"/>
+              <w:right w:val="single" w:color="BFBFBF" w:sz="4"/>
+            </w:tcBorders>
+            <w:tcMar>
+              <w:top w:type="dxa" w:w="60"/>
+              <w:left w:type="dxa" w:w="80"/>
+              <w:bottom w:type="dxa" w:w="60"/>
+              <w:right w:type="dxa" w:w="80"/>
+            </w:tcMar>
+          </w:tcPr>
+          <w:p>
+            <w:r>
+              <w:rPr>
+                <w:sz w:val="18"/>
+                <w:szCs w:val="18"/>
+              </w:rPr>
+              <w:t>D-14</w:t>
+            </w:r>
+          </w:p>
+        </w:tc>
+        <w:tc>
+          <w:tcPr>
+            <w:tcW w:type="dxa" w:w="1150"/>
+            <w:tcBorders>
+              <w:top w:val="single" w:color="BFBFBF" w:sz="4"/>
+              <w:left w:val="single" w:color="BFBFBF" w:sz="4"/>
+              <w:bottom w:val="single" w:color="BFBFBF" w:sz="4"/>
+              <w:right w:val="single" w:color="BFBFBF" w:sz="4"/>
+            </w:tcBorders>
+            <w:tcMar>
+              <w:top w:type="dxa" w:w="60"/>
+              <w:left w:type="dxa" w:w="80"/>
+              <w:bottom w:type="dxa" w:w="60"/>
+              <w:right w:type="dxa" w:w="80"/>
+            </w:tcMar>
+          </w:tcPr>
+          <w:p>
+            <w:r>
+              <w:rPr>
+                <w:sz w:val="18"/>
+                <w:szCs w:val="18"/>
+              </w:rPr>
+              <w:t>28/10/2026</w:t>
+            </w:r>
+          </w:p>
+        </w:tc>
+        <w:tc>
+          <w:tcPr>
+            <w:tcW w:type="dxa" w:w="2700"/>
+            <w:tcBorders>
+              <w:top w:val="single" w:color="BFBFBF" w:sz="4"/>
+              <w:left w:val="single" w:color="BFBFBF" w:sz="4"/>
+              <w:bottom w:val="single" w:color="BFBFBF" w:sz="4"/>
+              <w:right w:val="single" w:color="BFBFBF" w:sz="4"/>
+            </w:tcBorders>
+            <w:tcMar>
+              <w:top w:type="dxa" w:w="60"/>
+              <w:left w:type="dxa" w:w="80"/>
+              <w:bottom w:type="dxa" w:w="60"/>
+              <w:right w:type="dxa" w:w="80"/>
+            </w:tcMar>
+          </w:tcPr>
+          <w:p>
+            <w:r>
+              <w:rPr>
+                <w:sz w:val="18"/>
+                <w:szCs w:val="18"/>
+              </w:rPr>
+              <w:t>App visual en el navegador con Streamlit (src/app_visual.py), ejecutable aparte con streamlit run src/app_visual.py. Complementa a la CLI.</w:t>
+            </w:r>
+          </w:p>
+        </w:tc>
+        <w:tc>
+          <w:tcPr>
+            <w:tcW w:type="dxa" w:w="3176"/>
+            <w:tcBorders>
+              <w:top w:val="single" w:color="BFBFBF" w:sz="4"/>
+              <w:left w:val="single" w:color="BFBFBF" w:sz="4"/>
+              <w:bottom w:val="single" w:color="BFBFBF" w:sz="4"/>
+              <w:right w:val="single" w:color="BFBFBF" w:sz="4"/>
+            </w:tcBorders>
+            <w:tcMar>
+              <w:top w:type="dxa" w:w="60"/>
+              <w:left w:type="dxa" w:w="80"/>
+              <w:bottom w:type="dxa" w:w="60"/>
+              <w:right w:type="dxa" w:w="80"/>
+            </w:tcMar>
+          </w:tcPr>
+          <w:p>
+            <w:r>
+              <w:rPr>
+                <w:sz w:val="18"/>
+                <w:szCs w:val="18"/>
+              </w:rPr>
+              <w:t>Más clara para mostrar el modelo en la defensa: un alumno, métricas EM/ART 1 y CSV. CarGross.py sigue siendo el punto de entrada único. Usa entrenar_pipeline() de src/metrics.py: mismos resultados que la CLI.</w:t>
+            </w:r>
+          </w:p>
+        </w:tc>
+        <w:tc>
+          <w:tcPr>
+            <w:tcW w:type="dxa" w:w="1300"/>
+            <w:tcBorders>
+              <w:top w:val="single" w:color="BFBFBF" w:sz="4"/>
+              <w:left w:val="single" w:color="BFBFBF" w:sz="4"/>
+              <w:bottom w:val="single" w:color="BFBFBF" w:sz="4"/>
+              <w:right w:val="single" w:color="BFBFBF" w:sz="4"/>
+            </w:tcBorders>
+            <w:tcMar>
+              <w:top w:type="dxa" w:w="60"/>
+              <w:left w:type="dxa" w:w="80"/>
+              <w:bottom w:type="dxa" w:w="60"/>
+              <w:right w:type="dxa" w:w="80"/>
+            </w:tcMar>
+          </w:tcPr>
+          <w:p>
+            <w:r>
+              <w:rPr>
+                <w:sz w:val="18"/>
+                <w:szCs w:val="18"/>
+              </w:rPr>
+              <w:t>Aprobada</w:t>
+            </w:r>
+          </w:p>
+        </w:tc>
+      </w:tr>
+      <w:tr>
+        <w:trPr>
+          <w:cantSplit/>
+        </w:trPr>
+        <w:tc>
+          <w:tcPr>
+            <w:tcW w:type="dxa" w:w="700"/>
+            <w:tcBorders>
+              <w:top w:val="single" w:color="BFBFBF" w:sz="4"/>
+              <w:left w:val="single" w:color="BFBFBF" w:sz="4"/>
+              <w:bottom w:val="single" w:color="BFBFBF" w:sz="4"/>
+              <w:right w:val="single" w:color="BFBFBF" w:sz="4"/>
+            </w:tcBorders>
+            <w:tcMar>
+              <w:top w:type="dxa" w:w="60"/>
+              <w:left w:type="dxa" w:w="80"/>
+              <w:bottom w:type="dxa" w:w="60"/>
+              <w:right w:type="dxa" w:w="80"/>
+            </w:tcMar>
+          </w:tcPr>
+          <w:p>
+            <w:r>
+              <w:rPr>
+                <w:sz w:val="18"/>
+                <w:szCs w:val="18"/>
+              </w:rPr>
+              <w:t>D-15</w:t>
+            </w:r>
+          </w:p>
+        </w:tc>
+        <w:tc>
+          <w:tcPr>
+            <w:tcW w:type="dxa" w:w="1150"/>
+            <w:tcBorders>
+              <w:top w:val="single" w:color="BFBFBF" w:sz="4"/>
+              <w:left w:val="single" w:color="BFBFBF" w:sz="4"/>
+              <w:bottom w:val="single" w:color="BFBFBF" w:sz="4"/>
+              <w:right w:val="single" w:color="BFBFBF" w:sz="4"/>
+            </w:tcBorders>
+            <w:tcMar>
+              <w:top w:type="dxa" w:w="60"/>
+              <w:left w:type="dxa" w:w="80"/>
+              <w:bottom w:type="dxa" w:w="60"/>
+              <w:right w:type="dxa" w:w="80"/>
+            </w:tcMar>
+          </w:tcPr>
+          <w:p>
+            <w:r>
+              <w:rPr>
+                <w:sz w:val="18"/>
+                <w:szCs w:val="18"/>
+              </w:rPr>
+              <w:t>28/10/2026</w:t>
+            </w:r>
+          </w:p>
+        </w:tc>
+        <w:tc>
+          <w:tcPr>
+            <w:tcW w:type="dxa" w:w="2700"/>
+            <w:tcBorders>
+              <w:top w:val="single" w:color="BFBFBF" w:sz="4"/>
+              <w:left w:val="single" w:color="BFBFBF" w:sz="4"/>
+              <w:bottom w:val="single" w:color="BFBFBF" w:sz="4"/>
+              <w:right w:val="single" w:color="BFBFBF" w:sz="4"/>
+            </w:tcBorders>
+            <w:tcMar>
+              <w:top w:type="dxa" w:w="60"/>
+              <w:left w:type="dxa" w:w="80"/>
+              <w:bottom w:type="dxa" w:w="60"/>
+              <w:right w:type="dxa" w:w="80"/>
+            </w:tcMar>
+          </w:tcPr>
+          <w:p>
+            <w:r>
+              <w:rPr>
+                <w:sz w:val="18"/>
+                <w:szCs w:val="18"/>
+              </w:rPr>
+              <w:t>La categoría pronosticada se calcula con la nota esperada del nodo (Promoción &gt; 8, Regular 6–8, Recuperatorio 4–6, Riesgo &lt; 4). El perfil EM más común del nodo se informa aparte (perfil_em_nodo).</w:t>
+            </w:r>
+          </w:p>
+        </w:tc>
+        <w:tc>
+          <w:tcPr>
+            <w:tcW w:type="dxa" w:w="3176"/>
+            <w:tcBorders>
+              <w:top w:val="single" w:color="BFBFBF" w:sz="4"/>
+              <w:left w:val="single" w:color="BFBFBF" w:sz="4"/>
+              <w:bottom w:val="single" w:color="BFBFBF" w:sz="4"/>
+              <w:right w:val="single" w:color="BFBFBF" w:sz="4"/>
+            </w:tcBorders>
+            <w:tcMar>
+              <w:top w:type="dxa" w:w="60"/>
+              <w:left w:type="dxa" w:w="80"/>
+              <w:bottom w:type="dxa" w:w="60"/>
+              <w:right w:type="dxa" w:w="80"/>
+            </w:tcMar>
+          </w:tcPr>
+          <w:p>
+            <w:r>
+              <w:rPr>
+                <w:sz w:val="18"/>
+                <w:szCs w:val="18"/>
+              </w:rPr>
+              <w:t>Pedido de Juan: con la categoría EM del nodo, la categoría no coincidía con la nota (7,78 → Recuperatorio). Acierto 47,4% → 57,2%; MAE y pureza iguales. Contra: casi no pronostica los extremos (87 de 291 Promoción). Comentar con la cátedra.</w:t>
+            </w:r>
+          </w:p>
+        </w:tc>
+        <w:tc>
+          <w:tcPr>
+            <w:tcW w:type="dxa" w:w="1300"/>
+            <w:tcBorders>
+              <w:top w:val="single" w:color="BFBFBF" w:sz="4"/>
+              <w:left w:val="single" w:color="BFBFBF" w:sz="4"/>
+              <w:bottom w:val="single" w:color="BFBFBF" w:sz="4"/>
+              <w:right w:val="single" w:color="BFBFBF" w:sz="4"/>
+            </w:tcBorders>
+            <w:tcMar>
+              <w:top w:type="dxa" w:w="60"/>
+              <w:left w:type="dxa" w:w="80"/>
+              <w:bottom w:type="dxa" w:w="60"/>
+              <w:right w:type="dxa" w:w="80"/>
+            </w:tcMar>
+          </w:tcPr>
+          <w:p>
+            <w:r>
+              <w:rPr>
+                <w:sz w:val="18"/>
+                <w:szCs w:val="18"/>
+              </w:rPr>
+              <w:t>Aprobada</w:t>
+            </w:r>
+          </w:p>
+        </w:tc>
+      </w:tr>
+      <w:tr>
+        <w:trPr>
+          <w:cantSplit/>
+        </w:trPr>
+        <w:tc>
+          <w:tcPr>
+            <w:tcW w:type="dxa" w:w="700"/>
+            <w:tcBorders>
+              <w:top w:val="single" w:color="BFBFBF" w:sz="4"/>
+              <w:left w:val="single" w:color="BFBFBF" w:sz="4"/>
+              <w:bottom w:val="single" w:color="BFBFBF" w:sz="4"/>
+              <w:right w:val="single" w:color="BFBFBF" w:sz="4"/>
+            </w:tcBorders>
+            <w:tcMar>
+              <w:top w:type="dxa" w:w="60"/>
+              <w:left w:type="dxa" w:w="80"/>
+              <w:bottom w:type="dxa" w:w="60"/>
+              <w:right w:type="dxa" w:w="80"/>
+            </w:tcMar>
+          </w:tcPr>
+          <w:p>
+            <w:r>
+              <w:rPr>
+                <w:sz w:val="18"/>
+                <w:szCs w:val="18"/>
+              </w:rPr>
+              <w:t>D-16</w:t>
+            </w:r>
+          </w:p>
+        </w:tc>
+        <w:tc>
+          <w:tcPr>
+            <w:tcW w:type="dxa" w:w="1150"/>
+            <w:tcBorders>
+              <w:top w:val="single" w:color="BFBFBF" w:sz="4"/>
+              <w:left w:val="single" w:color="BFBFBF" w:sz="4"/>
+              <w:bottom w:val="single" w:color="BFBFBF" w:sz="4"/>
+              <w:right w:val="single" w:color="BFBFBF" w:sz="4"/>
+            </w:tcBorders>
+            <w:tcMar>
+              <w:top w:type="dxa" w:w="60"/>
+              <w:left w:type="dxa" w:w="80"/>
+              <w:bottom w:type="dxa" w:w="60"/>
+              <w:right w:type="dxa" w:w="80"/>
+            </w:tcMar>
+          </w:tcPr>
+          <w:p>
+            <w:r>
+              <w:rPr>
+                <w:sz w:val="18"/>
+                <w:szCs w:val="18"/>
+              </w:rPr>
+              <w:t>28/10/2026</w:t>
+            </w:r>
+          </w:p>
+        </w:tc>
+        <w:tc>
+          <w:tcPr>
+            <w:tcW w:type="dxa" w:w="2700"/>
+            <w:tcBorders>
+              <w:top w:val="single" w:color="BFBFBF" w:sz="4"/>
+              <w:left w:val="single" w:color="BFBFBF" w:sz="4"/>
+              <w:bottom w:val="single" w:color="BFBFBF" w:sz="4"/>
+              <w:right w:val="single" w:color="BFBFBF" w:sz="4"/>
+            </w:tcBorders>
+            <w:tcMar>
+              <w:top w:type="dxa" w:w="60"/>
+              <w:left w:type="dxa" w:w="80"/>
+              <w:bottom w:type="dxa" w:w="60"/>
+              <w:right w:type="dxa" w:w="80"/>
+            </w:tcMar>
+          </w:tcPr>
+          <w:p>
+            <w:r>
+              <w:rPr>
+                <w:sz w:val="18"/>
+                <w:szCs w:val="18"/>
+              </w:rPr>
+              <w:t>Confianza baja: si ningún nodo pasa la vigilancia, se usa el nodo que más unos del alumno cubre y, si empatan, el de más alumnos (antes, el más activado).</w:t>
+            </w:r>
+          </w:p>
+        </w:tc>
+        <w:tc>
+          <w:tcPr>
+            <w:tcW w:type="dxa" w:w="3176"/>
+            <w:tcBorders>
+              <w:top w:val="single" w:color="BFBFBF" w:sz="4"/>
+              <w:left w:val="single" w:color="BFBFBF" w:sz="4"/>
+              <w:bottom w:val="single" w:color="BFBFBF" w:sz="4"/>
+              <w:right w:val="single" w:color="BFBFBF" w:sz="4"/>
+            </w:tcBorders>
+            <w:tcMar>
+              <w:top w:type="dxa" w:w="60"/>
+              <w:left w:type="dxa" w:w="80"/>
+              <w:bottom w:type="dxa" w:w="60"/>
+              <w:right w:type="dxa" w:w="80"/>
+            </w:tcMar>
+          </w:tcPr>
+          <w:p>
+            <w:r>
+              <w:rPr>
+                <w:sz w:val="18"/>
+                <w:szCs w:val="18"/>
+              </w:rPr>
+              <w:t>El más activado suele ser un nodo de 1 alumno con prototipo chico: con 10 tareas daba 4,70 y con 9 tareas 6,16 (ahora 5,88). Afecta a 1 alumno del 20% reservado; métricas iguales.</w:t>
+            </w:r>
+          </w:p>
+        </w:tc>
+        <w:tc>
+          <w:tcPr>
+            <w:tcW w:type="dxa" w:w="1300"/>
+            <w:tcBorders>
+              <w:top w:val="single" w:color="BFBFBF" w:sz="4"/>
+              <w:left w:val="single" w:color="BFBFBF" w:sz="4"/>
+              <w:bottom w:val="single" w:color="BFBFBF" w:sz="4"/>
+              <w:right w:val="single" w:color="BFBFBF" w:sz="4"/>
+            </w:tcBorders>
+            <w:tcMar>
+              <w:top w:type="dxa" w:w="60"/>
+              <w:left w:type="dxa" w:w="80"/>
+              <w:bottom w:type="dxa" w:w="60"/>
+              <w:right w:type="dxa" w:w="80"/>
+            </w:tcMar>
+          </w:tcPr>
+          <w:p>
+            <w:r>
+              <w:rPr>
+                <w:sz w:val="18"/>
+                <w:szCs w:val="18"/>
+              </w:rPr>
+              <w:t>Aprobada</w:t>
+            </w:r>
+          </w:p>
+        </w:tc>
+      </w:tr>
+      <w:tr>
+        <w:trPr>
+          <w:cantSplit/>
+        </w:trPr>
+        <w:tc>
+          <w:tcPr>
+            <w:tcW w:type="dxa" w:w="700"/>
+            <w:tcBorders>
+              <w:top w:val="single" w:color="BFBFBF" w:sz="4"/>
+              <w:left w:val="single" w:color="BFBFBF" w:sz="4"/>
+              <w:bottom w:val="single" w:color="BFBFBF" w:sz="4"/>
+              <w:right w:val="single" w:color="BFBFBF" w:sz="4"/>
+            </w:tcBorders>
+            <w:tcMar>
+              <w:top w:type="dxa" w:w="60"/>
+              <w:left w:type="dxa" w:w="80"/>
+              <w:bottom w:type="dxa" w:w="60"/>
+              <w:right w:type="dxa" w:w="80"/>
+            </w:tcMar>
+          </w:tcPr>
+          <w:p>
+            <w:r>
+              <w:rPr>
+                <w:sz w:val="18"/>
+                <w:szCs w:val="18"/>
+              </w:rPr>
+              <w:t>D-17</w:t>
+            </w:r>
+          </w:p>
+        </w:tc>
+        <w:tc>
+          <w:tcPr>
+            <w:tcW w:type="dxa" w:w="1150"/>
+            <w:tcBorders>
+              <w:top w:val="single" w:color="BFBFBF" w:sz="4"/>
+              <w:left w:val="single" w:color="BFBFBF" w:sz="4"/>
+              <w:bottom w:val="single" w:color="BFBFBF" w:sz="4"/>
+              <w:right w:val="single" w:color="BFBFBF" w:sz="4"/>
+            </w:tcBorders>
+            <w:tcMar>
+              <w:top w:type="dxa" w:w="60"/>
+              <w:left w:type="dxa" w:w="80"/>
+              <w:bottom w:type="dxa" w:w="60"/>
+              <w:right w:type="dxa" w:w="80"/>
+            </w:tcMar>
+          </w:tcPr>
+          <w:p>
+            <w:r>
+              <w:rPr>
+                <w:sz w:val="18"/>
+                <w:szCs w:val="18"/>
+              </w:rPr>
+              <w:t>28/10/2026</w:t>
+            </w:r>
+          </w:p>
+        </w:tc>
+        <w:tc>
+          <w:tcPr>
+            <w:tcW w:type="dxa" w:w="2700"/>
+            <w:tcBorders>
+              <w:top w:val="single" w:color="BFBFBF" w:sz="4"/>
+              <w:left w:val="single" w:color="BFBFBF" w:sz="4"/>
+              <w:bottom w:val="single" w:color="BFBFBF" w:sz="4"/>
+              <w:right w:val="single" w:color="BFBFBF" w:sz="4"/>
+            </w:tcBorders>
+            <w:tcMar>
+              <w:top w:type="dxa" w:w="60"/>
+              <w:left w:type="dxa" w:w="80"/>
+              <w:bottom w:type="dxa" w:w="60"/>
+              <w:right w:type="dxa" w:w="80"/>
+            </w:tcMar>
+          </w:tcPr>
+          <w:p>
+            <w:r>
+              <w:rPr>
+                <w:sz w:val="18"/>
+                <w:szCs w:val="18"/>
+              </w:rPr>
+              <w:t>Se mantiene el modelo (ρ = 0,65, codificación binaria posicional) aunque la nota esperada no siempre sube al mejorar un hábito. Se documenta como limitación.</w:t>
+            </w:r>
+          </w:p>
+        </w:tc>
+        <w:tc>
+          <w:tcPr>
+            <w:tcW w:type="dxa" w:w="3176"/>
+            <w:tcBorders>
+              <w:top w:val="single" w:color="BFBFBF" w:sz="4"/>
+              <w:left w:val="single" w:color="BFBFBF" w:sz="4"/>
+              <w:bottom w:val="single" w:color="BFBFBF" w:sz="4"/>
+              <w:right w:val="single" w:color="BFBFBF" w:sz="4"/>
+            </w:tcBorders>
+            <w:tcMar>
+              <w:top w:type="dxa" w:w="60"/>
+              <w:left w:type="dxa" w:w="80"/>
+              <w:bottom w:type="dxa" w:w="60"/>
+              <w:right w:type="dxa" w:w="80"/>
+            </w:tcMar>
+          </w:tcPr>
+          <w:p>
+            <w:r>
+              <w:rPr>
+                <w:sz w:val="18"/>
+                <w:szCs w:val="18"/>
+              </w:rPr>
+              <w:t>En el 17,7% de los casos, mejorar una variable baja la nota más de 0,3 puntos (ej.: 9 tareas → 6,16; 10 tareas → 5,88). ART 1 solo compara bits, el código binario no es ordinal (0111 y 1000 no comparten bits) y 399 de 847 nodos tienen menos de 5 alumnos. Es propio de la arquitectura, no un error.</w:t>
+            </w:r>
+          </w:p>
+        </w:tc>
+        <w:tc>
+          <w:tcPr>
+            <w:tcW w:type="dxa" w:w="1300"/>
+            <w:tcBorders>
+              <w:top w:val="single" w:color="BFBFBF" w:sz="4"/>
+              <w:left w:val="single" w:color="BFBFBF" w:sz="4"/>
+              <w:bottom w:val="single" w:color="BFBFBF" w:sz="4"/>
+              <w:right w:val="single" w:color="BFBFBF" w:sz="4"/>
+            </w:tcBorders>
+            <w:tcMar>
+              <w:top w:type="dxa" w:w="60"/>
+              <w:left w:type="dxa" w:w="80"/>
+              <w:bottom w:type="dxa" w:w="60"/>
+              <w:right w:type="dxa" w:w="80"/>
+            </w:tcMar>
+          </w:tcPr>
+          <w:p>
+            <w:r>
+              <w:rPr>
+                <w:sz w:val="18"/>
+                <w:szCs w:val="18"/>
+              </w:rPr>
+              <w:t>Aprobada</w:t>
+            </w:r>
+          </w:p>
+        </w:tc>
+      </w:tr>
+      <w:tr>
+        <w:trPr>
+          <w:cantSplit/>
+        </w:trPr>
+        <w:tc>
+          <w:tcPr>
+            <w:tcW w:type="dxa" w:w="700"/>
+            <w:tcBorders>
+              <w:top w:val="single" w:color="BFBFBF" w:sz="4"/>
+              <w:left w:val="single" w:color="BFBFBF" w:sz="4"/>
+              <w:bottom w:val="single" w:color="BFBFBF" w:sz="4"/>
+              <w:right w:val="single" w:color="BFBFBF" w:sz="4"/>
+            </w:tcBorders>
+            <w:tcMar>
+              <w:top w:type="dxa" w:w="60"/>
+              <w:left w:type="dxa" w:w="80"/>
+              <w:bottom w:type="dxa" w:w="60"/>
+              <w:right w:type="dxa" w:w="80"/>
+            </w:tcMar>
+          </w:tcPr>
+          <w:p>
+            <w:r>
+              <w:rPr>
+                <w:sz w:val="18"/>
+                <w:szCs w:val="18"/>
+              </w:rPr>
+              <w:t>D-18</w:t>
+            </w:r>
+          </w:p>
+        </w:tc>
+        <w:tc>
+          <w:tcPr>
+            <w:tcW w:type="dxa" w:w="1150"/>
+            <w:tcBorders>
+              <w:top w:val="single" w:color="BFBFBF" w:sz="4"/>
+              <w:left w:val="single" w:color="BFBFBF" w:sz="4"/>
+              <w:bottom w:val="single" w:color="BFBFBF" w:sz="4"/>
+              <w:right w:val="single" w:color="BFBFBF" w:sz="4"/>
+            </w:tcBorders>
+            <w:tcMar>
+              <w:top w:type="dxa" w:w="60"/>
+              <w:left w:type="dxa" w:w="80"/>
+              <w:bottom w:type="dxa" w:w="60"/>
+              <w:right w:type="dxa" w:w="80"/>
+            </w:tcMar>
+          </w:tcPr>
+          <w:p>
+            <w:r>
+              <w:rPr>
+                <w:sz w:val="18"/>
+                <w:szCs w:val="18"/>
+              </w:rPr>
+              <w:t>28/10/2026</w:t>
+            </w:r>
+          </w:p>
+        </w:tc>
+        <w:tc>
+          <w:tcPr>
+            <w:tcW w:type="dxa" w:w="2700"/>
+            <w:tcBorders>
+              <w:top w:val="single" w:color="BFBFBF" w:sz="4"/>
+              <w:left w:val="single" w:color="BFBFBF" w:sz="4"/>
+              <w:bottom w:val="single" w:color="BFBFBF" w:sz="4"/>
+              <w:right w:val="single" w:color="BFBFBF" w:sz="4"/>
+            </w:tcBorders>
+            <w:tcMar>
+              <w:top w:type="dxa" w:w="60"/>
+              <w:left w:type="dxa" w:w="80"/>
+              <w:bottom w:type="dxa" w:w="60"/>
+              <w:right w:type="dxa" w:w="80"/>
+            </w:tcMar>
+          </w:tcPr>
+          <w:p>
+            <w:r>
+              <w:rPr>
+                <w:sz w:val="18"/>
+                <w:szCs w:val="18"/>
+              </w:rPr>
+              <w:t>Dataset 2 (benchmark): Student Performance Factors de Kaggle (6.607 alumnos). Entradas: Hours_Studied (por semana, escalada a 100), Attendance, Sleep_Hours (000–024), Tutoring_Sessions (escalada a 100) y Previous_Scores. Mismo pipeline: K = 4, ρ = 0,65. La app tiene un control para pasar de un dataset al otro.</w:t>
+            </w:r>
+          </w:p>
+        </w:tc>
+        <w:tc>
+          <w:tcPr>
+            <w:tcW w:type="dxa" w:w="3176"/>
+            <w:tcBorders>
+              <w:top w:val="single" w:color="BFBFBF" w:sz="4"/>
+              <w:left w:val="single" w:color="BFBFBF" w:sz="4"/>
+              <w:bottom w:val="single" w:color="BFBFBF" w:sz="4"/>
+              <w:right w:val="single" w:color="BFBFBF" w:sz="4"/>
+            </w:tcBorders>
+            <w:tcMar>
+              <w:top w:type="dxa" w:w="60"/>
+              <w:left w:type="dxa" w:w="80"/>
+              <w:bottom w:type="dxa" w:w="60"/>
+              <w:right w:type="dxa" w:w="80"/>
+            </w:tcMar>
+          </w:tcPr>
+          <w:p>
+            <w:r>
+              <w:rPr>
+                <w:sz w:val="18"/>
+                <w:szCs w:val="18"/>
+              </w:rPr>
+              <w:t>Lo pide la consigna (ítem 5: 2 datasets, ≥ 50 filas y ≥ 5 variables). Ningún dataset público tiene las 5 variables del dataset 1. Resultado: 394 nodos, pureza 84,6%, MAE 0,23 (dar la nota promedio: 0,29). El 98% de las notas está entre 6 y 8, así que el acierto de categoría (98%) no dice mucho.</w:t>
+            </w:r>
+          </w:p>
+        </w:tc>
+        <w:tc>
+          <w:tcPr>
+            <w:tcW w:type="dxa" w:w="1300"/>
+            <w:tcBorders>
+              <w:top w:val="single" w:color="BFBFBF" w:sz="4"/>
+              <w:left w:val="single" w:color="BFBFBF" w:sz="4"/>
+              <w:bottom w:val="single" w:color="BFBFBF" w:sz="4"/>
+              <w:right w:val="single" w:color="BFBFBF" w:sz="4"/>
+            </w:tcBorders>
+            <w:tcMar>
+              <w:top w:type="dxa" w:w="60"/>
+              <w:left w:type="dxa" w:w="80"/>
+              <w:bottom w:type="dxa" w:w="60"/>
+              <w:right w:type="dxa" w:w="80"/>
+            </w:tcMar>
+          </w:tcPr>
+          <w:p>
+            <w:r>
+              <w:rPr>
+                <w:sz w:val="18"/>
+                <w:szCs w:val="18"/>
+              </w:rPr>
+              <w:t>Aprobada</w:t>
+            </w:r>
+          </w:p>
+        </w:tc>
+      </w:tr>
+      <w:tr>
+        <w:trPr>
+          <w:cantSplit/>
+        </w:trPr>
+        <w:tc>
+          <w:tcPr>
+            <w:tcW w:type="dxa" w:w="700"/>
+            <w:tcBorders>
+              <w:top w:val="single" w:color="BFBFBF" w:sz="4"/>
+              <w:left w:val="single" w:color="BFBFBF" w:sz="4"/>
+              <w:bottom w:val="single" w:color="BFBFBF" w:sz="4"/>
+              <w:right w:val="single" w:color="BFBFBF" w:sz="4"/>
+            </w:tcBorders>
+            <w:tcMar>
+              <w:top w:type="dxa" w:w="60"/>
+              <w:left w:type="dxa" w:w="80"/>
+              <w:bottom w:type="dxa" w:w="60"/>
+              <w:right w:type="dxa" w:w="80"/>
+            </w:tcMar>
+          </w:tcPr>
+          <w:p>
+            <w:r>
+              <w:rPr>
+                <w:sz w:val="18"/>
+                <w:szCs w:val="18"/>
+              </w:rPr>
+              <w:t>D-19</w:t>
+            </w:r>
+          </w:p>
+        </w:tc>
+        <w:tc>
+          <w:tcPr>
+            <w:tcW w:type="dxa" w:w="1150"/>
+            <w:tcBorders>
+              <w:top w:val="single" w:color="BFBFBF" w:sz="4"/>
+              <w:left w:val="single" w:color="BFBFBF" w:sz="4"/>
+              <w:bottom w:val="single" w:color="BFBFBF" w:sz="4"/>
+              <w:right w:val="single" w:color="BFBFBF" w:sz="4"/>
+            </w:tcBorders>
+            <w:tcMar>
+              <w:top w:type="dxa" w:w="60"/>
+              <w:left w:type="dxa" w:w="80"/>
+              <w:bottom w:type="dxa" w:w="60"/>
+              <w:right w:type="dxa" w:w="80"/>
+            </w:tcMar>
+          </w:tcPr>
+          <w:p>
+            <w:r>
+              <w:rPr>
+                <w:sz w:val="18"/>
+                <w:szCs w:val="18"/>
+              </w:rPr>
+              <w:t>28/10/2026</w:t>
+            </w:r>
+          </w:p>
+        </w:tc>
+        <w:tc>
+          <w:tcPr>
+            <w:tcW w:type="dxa" w:w="2700"/>
+            <w:tcBorders>
+              <w:top w:val="single" w:color="BFBFBF" w:sz="4"/>
+              <w:left w:val="single" w:color="BFBFBF" w:sz="4"/>
+              <w:bottom w:val="single" w:color="BFBFBF" w:sz="4"/>
+              <w:right w:val="single" w:color="BFBFBF" w:sz="4"/>
+            </w:tcBorders>
+            <w:tcMar>
+              <w:top w:type="dxa" w:w="60"/>
+              <w:left w:type="dxa" w:w="80"/>
+              <w:bottom w:type="dxa" w:w="60"/>
+              <w:right w:type="dxa" w:w="80"/>
+            </w:tcMar>
+          </w:tcPr>
+          <w:p>
+            <w:r>
+              <w:rPr>
+                <w:sz w:val="18"/>
+                <w:szCs w:val="18"/>
+              </w:rPr>
+              <w:t>CLI CarGross.py (ISSUE-301): modos train, eval, predict, sweep y demo; datos con -d y -m o con el atajo --dataset 1|2; salida solo en CSV (data/output). Ante cualquier error muestra el motivo y el manual man y sale con código 2 (opciones), 3 (archivo), 4 (datos) o 1 (inesperado).</w:t>
+            </w:r>
+          </w:p>
+        </w:tc>
+        <w:tc>
+          <w:tcPr>
+            <w:tcW w:type="dxa" w:w="3176"/>
+            <w:tcBorders>
+              <w:top w:val="single" w:color="BFBFBF" w:sz="4"/>
+              <w:left w:val="single" w:color="BFBFBF" w:sz="4"/>
+              <w:bottom w:val="single" w:color="BFBFBF" w:sz="4"/>
+              <w:right w:val="single" w:color="BFBFBF" w:sz="4"/>
+            </w:tcBorders>
+            <w:tcMar>
+              <w:top w:type="dxa" w:w="60"/>
+              <w:left w:type="dxa" w:w="80"/>
+              <w:bottom w:type="dxa" w:w="60"/>
+              <w:right w:type="dxa" w:w="80"/>
+            </w:tcMar>
+          </w:tcPr>
+          <w:p>
+            <w:r>
+              <w:rPr>
+                <w:sz w:val="18"/>
+                <w:szCs w:val="18"/>
+              </w:rPr>
+              <w:t>Lo pide la cátedra (punto de entrada único, CSV, control total de excepciones con man). Usa el mismo entrenar_pipeline() que src.metrics y la app, así los números coinciden (dataset 1: 871 nodos, MAE 0,935). Se agregó predict para alumnos nuevos sin nota. Un código por tipo de error es más claro que los del ejemplo del documento de arquitectura.</w:t>
+            </w:r>
+          </w:p>
+        </w:tc>
+        <w:tc>
+          <w:tcPr>
+            <w:tcW w:type="dxa" w:w="1300"/>
+            <w:tcBorders>
+              <w:top w:val="single" w:color="BFBFBF" w:sz="4"/>
+              <w:left w:val="single" w:color="BFBFBF" w:sz="4"/>
+              <w:bottom w:val="single" w:color="BFBFBF" w:sz="4"/>
+              <w:right w:val="single" w:color="BFBFBF" w:sz="4"/>
+            </w:tcBorders>
+            <w:tcMar>
+              <w:top w:type="dxa" w:w="60"/>
+              <w:left w:type="dxa" w:w="80"/>
+              <w:bottom w:type="dxa" w:w="60"/>
+              <w:right w:type="dxa" w:w="80"/>
+            </w:tcMar>
+          </w:tcPr>
+          <w:p>
+            <w:r>
+              <w:rPr>
+                <w:sz w:val="18"/>
+                <w:szCs w:val="18"/>
+              </w:rPr>
+              <w:t>Implementada</w:t>
             </w:r>
           </w:p>
         </w:tc>
@@ -2038,23 +2983,6 @@
           <w:szCs w:val="20"/>
         </w:rPr>
         <w:t xml:space="preserve">Verificar que previous_score sea de materias comparables.</w:t>
-      </w:r>
-    </w:p>
-    <w:p>
-      <w:pPr>
-        <w:pStyle w:val="ListParagraph"/>
-        <w:numPr>
-          <w:ilvl w:val="0"/>
-          <w:numId w:val="2"/>
-        </w:numPr>
-        <w:spacing w:after="40"/>
-      </w:pPr>
-      <w:r>
-        <w:rPr>
-          <w:sz w:val="20"/>
-          <w:szCs w:val="20"/>
-        </w:rPr>
-        <w:t xml:space="preserve">Elegir el dataset 2 (benchmark).</w:t>
       </w:r>
     </w:p>
     <w:sectPr>

</xml_diff>